<commit_message>
Diagrama de base de datos generado desde el esquema real de MySQL
Pata de gallo con las 16 tablas del sistema, columnas, tipos, nulos, PK/FK/UK y la
regla ON DELETE de las 13 claves foráneas; también en Mermaid. Corrige en el tutorial
de base de datos las columnas de clients (no tiene correo).

Co-Authored-By: Claude Opus 5.5 <noreply@anthropic.com>
</commit_message>
<xml_diff>
--- a/docs/base-de-datos/LeGrandHotel_Tutorial_Base_de_datos.docx
+++ b/docs/base-de-datos/LeGrandHotel_Tutorial_Base_de_datos.docx
@@ -34,7 +34,7 @@
           <w:noProof/>
         </w:rPr>
         <w:drawing>
-          <wp:inline distT="0" distB="0" distL="0" distR="0" wp14:anchorId="706A71AA" wp14:editId="3E9778CD">
+          <wp:inline distT="0" distB="0" distL="0" distR="0" wp14:anchorId="5032A9B8" wp14:editId="42A5E876">
             <wp:extent cx="1800225" cy="1076325"/>
             <wp:effectExtent l="0" t="0" r="0" b="0"/>
             <wp:docPr id="1" name="Imagen 1"/>
@@ -254,7 +254,7 @@
     <w:sdt>
       <w:sdtPr>
         <w:alias w:val="Índice"/>
-        <w:id w:val="1877732998"/>
+        <w:id w:val="1511178928"/>
       </w:sdtPr>
       <w:sdtEndPr/>
       <w:sdtContent>
@@ -280,7 +280,7 @@
           <w:r>
             <w:fldChar w:fldCharType="separate"/>
           </w:r>
-          <w:hyperlink w:anchor="_Toc244028460" w:history="1">
+          <w:hyperlink w:anchor="_Toc244033224" w:history="1">
             <w:r>
               <w:rPr>
                 <w:rStyle w:val="Hipervnculo"/>
@@ -304,7 +304,7 @@
               <w:rPr>
                 <w:noProof/>
               </w:rPr>
-              <w:instrText xml:space="preserve"> PAGEREF _Toc244028460 \h </w:instrText>
+              <w:instrText xml:space="preserve"> PAGEREF _Toc244033224 \h </w:instrText>
             </w:r>
             <w:r>
               <w:rPr>
@@ -344,7 +344,7 @@
               <w14:ligatures w14:val="standardContextual"/>
             </w:rPr>
           </w:pPr>
-          <w:hyperlink w:anchor="_Toc244028461" w:history="1">
+          <w:hyperlink w:anchor="_Toc244033225" w:history="1">
             <w:r>
               <w:rPr>
                 <w:rStyle w:val="Hipervnculo"/>
@@ -368,7 +368,7 @@
               <w:rPr>
                 <w:noProof/>
               </w:rPr>
-              <w:instrText xml:space="preserve"> PAGEREF _Toc244028461 \h </w:instrText>
+              <w:instrText xml:space="preserve"> PAGEREF _Toc244033225 \h </w:instrText>
             </w:r>
             <w:r>
               <w:rPr>
@@ -408,7 +408,7 @@
               <w14:ligatures w14:val="standardContextual"/>
             </w:rPr>
           </w:pPr>
-          <w:hyperlink w:anchor="_Toc244028462" w:history="1">
+          <w:hyperlink w:anchor="_Toc244033226" w:history="1">
             <w:r>
               <w:rPr>
                 <w:rStyle w:val="Hipervnculo"/>
@@ -432,7 +432,7 @@
               <w:rPr>
                 <w:noProof/>
               </w:rPr>
-              <w:instrText xml:space="preserve"> PAGEREF _Toc244028462 \h </w:instrText>
+              <w:instrText xml:space="preserve"> PAGEREF _Toc244033226 \h </w:instrText>
             </w:r>
             <w:r>
               <w:rPr>
@@ -472,7 +472,7 @@
               <w14:ligatures w14:val="standardContextual"/>
             </w:rPr>
           </w:pPr>
-          <w:hyperlink w:anchor="_Toc244028463" w:history="1">
+          <w:hyperlink w:anchor="_Toc244033227" w:history="1">
             <w:r>
               <w:rPr>
                 <w:rStyle w:val="Hipervnculo"/>
@@ -496,7 +496,7 @@
               <w:rPr>
                 <w:noProof/>
               </w:rPr>
-              <w:instrText xml:space="preserve"> PAGEREF _Toc244028463 \h </w:instrText>
+              <w:instrText xml:space="preserve"> PAGEREF _Toc244033227 \h </w:instrText>
             </w:r>
             <w:r>
               <w:rPr>
@@ -536,7 +536,7 @@
               <w14:ligatures w14:val="standardContextual"/>
             </w:rPr>
           </w:pPr>
-          <w:hyperlink w:anchor="_Toc244028464" w:history="1">
+          <w:hyperlink w:anchor="_Toc244033228" w:history="1">
             <w:r>
               <w:rPr>
                 <w:rStyle w:val="Hipervnculo"/>
@@ -560,7 +560,7 @@
               <w:rPr>
                 <w:noProof/>
               </w:rPr>
-              <w:instrText xml:space="preserve"> PAGEREF _Toc244028464 \h </w:instrText>
+              <w:instrText xml:space="preserve"> PAGEREF _Toc244033228 \h </w:instrText>
             </w:r>
             <w:r>
               <w:rPr>
@@ -600,7 +600,7 @@
               <w14:ligatures w14:val="standardContextual"/>
             </w:rPr>
           </w:pPr>
-          <w:hyperlink w:anchor="_Toc244028465" w:history="1">
+          <w:hyperlink w:anchor="_Toc244033229" w:history="1">
             <w:r>
               <w:rPr>
                 <w:rStyle w:val="Hipervnculo"/>
@@ -624,7 +624,7 @@
               <w:rPr>
                 <w:noProof/>
               </w:rPr>
-              <w:instrText xml:space="preserve"> PAGEREF _Toc244028465 \h </w:instrText>
+              <w:instrText xml:space="preserve"> PAGEREF _Toc244033229 \h </w:instrText>
             </w:r>
             <w:r>
               <w:rPr>
@@ -664,7 +664,7 @@
               <w14:ligatures w14:val="standardContextual"/>
             </w:rPr>
           </w:pPr>
-          <w:hyperlink w:anchor="_Toc244028466" w:history="1">
+          <w:hyperlink w:anchor="_Toc244033230" w:history="1">
             <w:r>
               <w:rPr>
                 <w:rStyle w:val="Hipervnculo"/>
@@ -688,7 +688,7 @@
               <w:rPr>
                 <w:noProof/>
               </w:rPr>
-              <w:instrText xml:space="preserve"> PAGEREF _Toc244028466 \h </w:instrText>
+              <w:instrText xml:space="preserve"> PAGEREF _Toc244033230 \h </w:instrText>
             </w:r>
             <w:r>
               <w:rPr>
@@ -728,7 +728,7 @@
               <w14:ligatures w14:val="standardContextual"/>
             </w:rPr>
           </w:pPr>
-          <w:hyperlink w:anchor="_Toc244028467" w:history="1">
+          <w:hyperlink w:anchor="_Toc244033231" w:history="1">
             <w:r>
               <w:rPr>
                 <w:rStyle w:val="Hipervnculo"/>
@@ -752,7 +752,7 @@
               <w:rPr>
                 <w:noProof/>
               </w:rPr>
-              <w:instrText xml:space="preserve"> PAGEREF _Toc244028467 \h </w:instrText>
+              <w:instrText xml:space="preserve"> PAGEREF _Toc244033231 \h </w:instrText>
             </w:r>
             <w:r>
               <w:rPr>
@@ -792,7 +792,7 @@
               <w14:ligatures w14:val="standardContextual"/>
             </w:rPr>
           </w:pPr>
-          <w:hyperlink w:anchor="_Toc244028468" w:history="1">
+          <w:hyperlink w:anchor="_Toc244033232" w:history="1">
             <w:r>
               <w:rPr>
                 <w:rStyle w:val="Hipervnculo"/>
@@ -816,7 +816,7 @@
               <w:rPr>
                 <w:noProof/>
               </w:rPr>
-              <w:instrText xml:space="preserve"> PAGEREF _Toc244028468 \h </w:instrText>
+              <w:instrText xml:space="preserve"> PAGEREF _Toc244033232 \h </w:instrText>
             </w:r>
             <w:r>
               <w:rPr>
@@ -856,7 +856,7 @@
               <w14:ligatures w14:val="standardContextual"/>
             </w:rPr>
           </w:pPr>
-          <w:hyperlink w:anchor="_Toc244028469" w:history="1">
+          <w:hyperlink w:anchor="_Toc244033233" w:history="1">
             <w:r>
               <w:rPr>
                 <w:rStyle w:val="Hipervnculo"/>
@@ -880,7 +880,7 @@
               <w:rPr>
                 <w:noProof/>
               </w:rPr>
-              <w:instrText xml:space="preserve"> PAGEREF _Toc244028469 \h </w:instrText>
+              <w:instrText xml:space="preserve"> PAGEREF _Toc244033233 \h </w:instrText>
             </w:r>
             <w:r>
               <w:rPr>
@@ -920,7 +920,7 @@
               <w14:ligatures w14:val="standardContextual"/>
             </w:rPr>
           </w:pPr>
-          <w:hyperlink w:anchor="_Toc244028470" w:history="1">
+          <w:hyperlink w:anchor="_Toc244033234" w:history="1">
             <w:r>
               <w:rPr>
                 <w:rStyle w:val="Hipervnculo"/>
@@ -944,7 +944,7 @@
               <w:rPr>
                 <w:noProof/>
               </w:rPr>
-              <w:instrText xml:space="preserve"> PAGEREF _Toc244028470 \h </w:instrText>
+              <w:instrText xml:space="preserve"> PAGEREF _Toc244033234 \h </w:instrText>
             </w:r>
             <w:r>
               <w:rPr>
@@ -984,7 +984,7 @@
               <w14:ligatures w14:val="standardContextual"/>
             </w:rPr>
           </w:pPr>
-          <w:hyperlink w:anchor="_Toc244028471" w:history="1">
+          <w:hyperlink w:anchor="_Toc244033235" w:history="1">
             <w:r>
               <w:rPr>
                 <w:rStyle w:val="Hipervnculo"/>
@@ -1008,7 +1008,7 @@
               <w:rPr>
                 <w:noProof/>
               </w:rPr>
-              <w:instrText xml:space="preserve"> PAGEREF _Toc244028471 \h </w:instrText>
+              <w:instrText xml:space="preserve"> PAGEREF _Toc244033235 \h </w:instrText>
             </w:r>
             <w:r>
               <w:rPr>
@@ -1048,7 +1048,7 @@
               <w14:ligatures w14:val="standardContextual"/>
             </w:rPr>
           </w:pPr>
-          <w:hyperlink w:anchor="_Toc244028472" w:history="1">
+          <w:hyperlink w:anchor="_Toc244033236" w:history="1">
             <w:r>
               <w:rPr>
                 <w:rStyle w:val="Hipervnculo"/>
@@ -1072,7 +1072,7 @@
               <w:rPr>
                 <w:noProof/>
               </w:rPr>
-              <w:instrText xml:space="preserve"> PAGEREF _Toc244028472 \h </w:instrText>
+              <w:instrText xml:space="preserve"> PAGEREF _Toc244033236 \h </w:instrText>
             </w:r>
             <w:r>
               <w:rPr>
@@ -1112,7 +1112,7 @@
               <w14:ligatures w14:val="standardContextual"/>
             </w:rPr>
           </w:pPr>
-          <w:hyperlink w:anchor="_Toc244028473" w:history="1">
+          <w:hyperlink w:anchor="_Toc244033237" w:history="1">
             <w:r>
               <w:rPr>
                 <w:rStyle w:val="Hipervnculo"/>
@@ -1136,7 +1136,7 @@
               <w:rPr>
                 <w:noProof/>
               </w:rPr>
-              <w:instrText xml:space="preserve"> PAGEREF _Toc244028473 \h </w:instrText>
+              <w:instrText xml:space="preserve"> PAGEREF _Toc244033237 \h </w:instrText>
             </w:r>
             <w:r>
               <w:rPr>
@@ -1176,7 +1176,7 @@
               <w14:ligatures w14:val="standardContextual"/>
             </w:rPr>
           </w:pPr>
-          <w:hyperlink w:anchor="_Toc244028474" w:history="1">
+          <w:hyperlink w:anchor="_Toc244033238" w:history="1">
             <w:r>
               <w:rPr>
                 <w:rStyle w:val="Hipervnculo"/>
@@ -1200,7 +1200,7 @@
               <w:rPr>
                 <w:noProof/>
               </w:rPr>
-              <w:instrText xml:space="preserve"> PAGEREF _Toc244028474 \h </w:instrText>
+              <w:instrText xml:space="preserve"> PAGEREF _Toc244033238 \h </w:instrText>
             </w:r>
             <w:r>
               <w:rPr>
@@ -1240,7 +1240,7 @@
               <w14:ligatures w14:val="standardContextual"/>
             </w:rPr>
           </w:pPr>
-          <w:hyperlink w:anchor="_Toc244028475" w:history="1">
+          <w:hyperlink w:anchor="_Toc244033239" w:history="1">
             <w:r>
               <w:rPr>
                 <w:rStyle w:val="Hipervnculo"/>
@@ -1264,7 +1264,7 @@
               <w:rPr>
                 <w:noProof/>
               </w:rPr>
-              <w:instrText xml:space="preserve"> PAGEREF _Toc244028475 \h </w:instrText>
+              <w:instrText xml:space="preserve"> PAGEREF _Toc244033239 \h </w:instrText>
             </w:r>
             <w:r>
               <w:rPr>
@@ -1304,7 +1304,7 @@
               <w14:ligatures w14:val="standardContextual"/>
             </w:rPr>
           </w:pPr>
-          <w:hyperlink w:anchor="_Toc244028476" w:history="1">
+          <w:hyperlink w:anchor="_Toc244033240" w:history="1">
             <w:r>
               <w:rPr>
                 <w:rStyle w:val="Hipervnculo"/>
@@ -1328,7 +1328,7 @@
               <w:rPr>
                 <w:noProof/>
               </w:rPr>
-              <w:instrText xml:space="preserve"> PAGEREF _Toc244028476 \h </w:instrText>
+              <w:instrText xml:space="preserve"> PAGEREF _Toc244033240 \h </w:instrText>
             </w:r>
             <w:r>
               <w:rPr>
@@ -1368,7 +1368,7 @@
               <w14:ligatures w14:val="standardContextual"/>
             </w:rPr>
           </w:pPr>
-          <w:hyperlink w:anchor="_Toc244028477" w:history="1">
+          <w:hyperlink w:anchor="_Toc244033241" w:history="1">
             <w:r>
               <w:rPr>
                 <w:rStyle w:val="Hipervnculo"/>
@@ -1392,7 +1392,7 @@
               <w:rPr>
                 <w:noProof/>
               </w:rPr>
-              <w:instrText xml:space="preserve"> PAGEREF _Toc244028477 \h </w:instrText>
+              <w:instrText xml:space="preserve"> PAGEREF _Toc244033241 \h </w:instrText>
             </w:r>
             <w:r>
               <w:rPr>
@@ -1432,7 +1432,7 @@
               <w14:ligatures w14:val="standardContextual"/>
             </w:rPr>
           </w:pPr>
-          <w:hyperlink w:anchor="_Toc244028478" w:history="1">
+          <w:hyperlink w:anchor="_Toc244033242" w:history="1">
             <w:r>
               <w:rPr>
                 <w:rStyle w:val="Hipervnculo"/>
@@ -1456,7 +1456,7 @@
               <w:rPr>
                 <w:noProof/>
               </w:rPr>
-              <w:instrText xml:space="preserve"> PAGEREF _Toc244028478 \h </w:instrText>
+              <w:instrText xml:space="preserve"> PAGEREF _Toc244033242 \h </w:instrText>
             </w:r>
             <w:r>
               <w:rPr>
@@ -1496,7 +1496,7 @@
               <w14:ligatures w14:val="standardContextual"/>
             </w:rPr>
           </w:pPr>
-          <w:hyperlink w:anchor="_Toc244028479" w:history="1">
+          <w:hyperlink w:anchor="_Toc244033243" w:history="1">
             <w:r>
               <w:rPr>
                 <w:rStyle w:val="Hipervnculo"/>
@@ -1520,7 +1520,7 @@
               <w:rPr>
                 <w:noProof/>
               </w:rPr>
-              <w:instrText xml:space="preserve"> PAGEREF _Toc244028479 \h </w:instrText>
+              <w:instrText xml:space="preserve"> PAGEREF _Toc244033243 \h </w:instrText>
             </w:r>
             <w:r>
               <w:rPr>
@@ -1560,7 +1560,7 @@
               <w14:ligatures w14:val="standardContextual"/>
             </w:rPr>
           </w:pPr>
-          <w:hyperlink w:anchor="_Toc244028480" w:history="1">
+          <w:hyperlink w:anchor="_Toc244033244" w:history="1">
             <w:r>
               <w:rPr>
                 <w:rStyle w:val="Hipervnculo"/>
@@ -1584,7 +1584,7 @@
               <w:rPr>
                 <w:noProof/>
               </w:rPr>
-              <w:instrText xml:space="preserve"> PAGEREF _Toc244028480 \h </w:instrText>
+              <w:instrText xml:space="preserve"> PAGEREF _Toc244033244 \h </w:instrText>
             </w:r>
             <w:r>
               <w:rPr>
@@ -1624,7 +1624,7 @@
               <w14:ligatures w14:val="standardContextual"/>
             </w:rPr>
           </w:pPr>
-          <w:hyperlink w:anchor="_Toc244028481" w:history="1">
+          <w:hyperlink w:anchor="_Toc244033245" w:history="1">
             <w:r>
               <w:rPr>
                 <w:rStyle w:val="Hipervnculo"/>
@@ -1648,7 +1648,7 @@
               <w:rPr>
                 <w:noProof/>
               </w:rPr>
-              <w:instrText xml:space="preserve"> PAGEREF _Toc244028481 \h </w:instrText>
+              <w:instrText xml:space="preserve"> PAGEREF _Toc244033245 \h </w:instrText>
             </w:r>
             <w:r>
               <w:rPr>
@@ -1688,7 +1688,7 @@
               <w14:ligatures w14:val="standardContextual"/>
             </w:rPr>
           </w:pPr>
-          <w:hyperlink w:anchor="_Toc244028482" w:history="1">
+          <w:hyperlink w:anchor="_Toc244033246" w:history="1">
             <w:r>
               <w:rPr>
                 <w:rStyle w:val="Hipervnculo"/>
@@ -1712,7 +1712,7 @@
               <w:rPr>
                 <w:noProof/>
               </w:rPr>
-              <w:instrText xml:space="preserve"> PAGEREF _Toc244028482 \h </w:instrText>
+              <w:instrText xml:space="preserve"> PAGEREF _Toc244033246 \h </w:instrText>
             </w:r>
             <w:r>
               <w:rPr>
@@ -1752,7 +1752,7 @@
               <w14:ligatures w14:val="standardContextual"/>
             </w:rPr>
           </w:pPr>
-          <w:hyperlink w:anchor="_Toc244028483" w:history="1">
+          <w:hyperlink w:anchor="_Toc244033247" w:history="1">
             <w:r>
               <w:rPr>
                 <w:rStyle w:val="Hipervnculo"/>
@@ -1776,7 +1776,7 @@
               <w:rPr>
                 <w:noProof/>
               </w:rPr>
-              <w:instrText xml:space="preserve"> PAGEREF _Toc244028483 \h </w:instrText>
+              <w:instrText xml:space="preserve"> PAGEREF _Toc244033247 \h </w:instrText>
             </w:r>
             <w:r>
               <w:rPr>
@@ -1816,7 +1816,7 @@
               <w14:ligatures w14:val="standardContextual"/>
             </w:rPr>
           </w:pPr>
-          <w:hyperlink w:anchor="_Toc244028484" w:history="1">
+          <w:hyperlink w:anchor="_Toc244033248" w:history="1">
             <w:r>
               <w:rPr>
                 <w:rStyle w:val="Hipervnculo"/>
@@ -1840,7 +1840,7 @@
               <w:rPr>
                 <w:noProof/>
               </w:rPr>
-              <w:instrText xml:space="preserve"> PAGEREF _Toc244028484 \h </w:instrText>
+              <w:instrText xml:space="preserve"> PAGEREF _Toc244033248 \h </w:instrText>
             </w:r>
             <w:r>
               <w:rPr>
@@ -1880,7 +1880,7 @@
               <w14:ligatures w14:val="standardContextual"/>
             </w:rPr>
           </w:pPr>
-          <w:hyperlink w:anchor="_Toc244028485" w:history="1">
+          <w:hyperlink w:anchor="_Toc244033249" w:history="1">
             <w:r>
               <w:rPr>
                 <w:rStyle w:val="Hipervnculo"/>
@@ -1904,7 +1904,7 @@
               <w:rPr>
                 <w:noProof/>
               </w:rPr>
-              <w:instrText xml:space="preserve"> PAGEREF _Toc244028485 \h </w:instrText>
+              <w:instrText xml:space="preserve"> PAGEREF _Toc244033249 \h </w:instrText>
             </w:r>
             <w:r>
               <w:rPr>
@@ -1944,7 +1944,7 @@
               <w14:ligatures w14:val="standardContextual"/>
             </w:rPr>
           </w:pPr>
-          <w:hyperlink w:anchor="_Toc244028486" w:history="1">
+          <w:hyperlink w:anchor="_Toc244033250" w:history="1">
             <w:r>
               <w:rPr>
                 <w:rStyle w:val="Hipervnculo"/>
@@ -1968,7 +1968,7 @@
               <w:rPr>
                 <w:noProof/>
               </w:rPr>
-              <w:instrText xml:space="preserve"> PAGEREF _Toc244028486 \h </w:instrText>
+              <w:instrText xml:space="preserve"> PAGEREF _Toc244033250 \h </w:instrText>
             </w:r>
             <w:r>
               <w:rPr>
@@ -2008,7 +2008,7 @@
               <w14:ligatures w14:val="standardContextual"/>
             </w:rPr>
           </w:pPr>
-          <w:hyperlink w:anchor="_Toc244028487" w:history="1">
+          <w:hyperlink w:anchor="_Toc244033251" w:history="1">
             <w:r>
               <w:rPr>
                 <w:rStyle w:val="Hipervnculo"/>
@@ -2032,7 +2032,7 @@
               <w:rPr>
                 <w:noProof/>
               </w:rPr>
-              <w:instrText xml:space="preserve"> PAGEREF _Toc244028487 \h </w:instrText>
+              <w:instrText xml:space="preserve"> PAGEREF _Toc244033251 \h </w:instrText>
             </w:r>
             <w:r>
               <w:rPr>
@@ -2076,7 +2076,7 @@
         <w:pStyle w:val="Ttulo1"/>
         <w:keepNext/>
       </w:pPr>
-      <w:bookmarkStart w:id="0" w:name="_Toc244028460"/>
+      <w:bookmarkStart w:id="0" w:name="_Toc244033224"/>
       <w:r>
         <w:lastRenderedPageBreak/>
         <w:t>1. Qué base de datos usa LeGrandHotel</w:t>
@@ -2488,7 +2488,7 @@
         <w:pStyle w:val="Ttulo2"/>
         <w:keepNext/>
       </w:pPr>
-      <w:bookmarkStart w:id="1" w:name="_Toc244028461"/>
+      <w:bookmarkStart w:id="1" w:name="_Toc244033225"/>
       <w:r>
         <w:t>1.1 Qué vas a lograr</w:t>
       </w:r>
@@ -2564,7 +2564,7 @@
         <w:pStyle w:val="Ttulo2"/>
         <w:keepNext/>
       </w:pPr>
-      <w:bookmarkStart w:id="2" w:name="_Toc244028462"/>
+      <w:bookmarkStart w:id="2" w:name="_Toc244033226"/>
       <w:r>
         <w:t>1.2 Qué necesitas</w:t>
       </w:r>
@@ -2627,7 +2627,7 @@
         <w:pStyle w:val="Ttulo1"/>
         <w:keepNext/>
       </w:pPr>
-      <w:bookmarkStart w:id="3" w:name="_Toc244028463"/>
+      <w:bookmarkStart w:id="3" w:name="_Toc244033227"/>
       <w:r>
         <w:t>2. Los datos de conexión</w:t>
       </w:r>
@@ -3377,7 +3377,7 @@
         <w:pStyle w:val="Ttulo1"/>
         <w:keepNext/>
       </w:pPr>
-      <w:bookmarkStart w:id="4" w:name="_Toc244028464"/>
+      <w:bookmarkStart w:id="4" w:name="_Toc244033228"/>
       <w:r>
         <w:t>3. Paso 1: encender Docker Desktop</w:t>
       </w:r>
@@ -3429,7 +3429,7 @@
         <w:pStyle w:val="Ttulo1"/>
         <w:keepNext/>
       </w:pPr>
-      <w:bookmarkStart w:id="5" w:name="_Toc244028465"/>
+      <w:bookmarkStart w:id="5" w:name="_Toc244033229"/>
       <w:r>
         <w:t>4. Paso 2: encender la base de datos</w:t>
       </w:r>
@@ -3503,7 +3503,7 @@
           <w:noProof/>
         </w:rPr>
         <w:drawing>
-          <wp:inline distT="0" distB="0" distL="0" distR="0" wp14:anchorId="540215A1" wp14:editId="6F04B46D">
+          <wp:inline distT="0" distB="0" distL="0" distR="0" wp14:anchorId="71D3D0EE" wp14:editId="66032109">
             <wp:extent cx="5400675" cy="590550"/>
             <wp:effectExtent l="0" t="0" r="0" b="0"/>
             <wp:docPr id="2" name="Imagen 2"/>
@@ -3624,7 +3624,7 @@
         </w:rPr>
         <w:lastRenderedPageBreak/>
         <w:drawing>
-          <wp:inline distT="0" distB="0" distL="0" distR="0" wp14:anchorId="228AABDE" wp14:editId="3CF01746">
+          <wp:inline distT="0" distB="0" distL="0" distR="0" wp14:anchorId="211749BC" wp14:editId="1574879E">
             <wp:extent cx="5400675" cy="685800"/>
             <wp:effectExtent l="0" t="0" r="0" b="0"/>
             <wp:docPr id="3" name="Imagen 3"/>
@@ -3698,7 +3698,7 @@
         <w:pStyle w:val="Ttulo1"/>
         <w:keepNext/>
       </w:pPr>
-      <w:bookmarkStart w:id="6" w:name="_Toc244028466"/>
+      <w:bookmarkStart w:id="6" w:name="_Toc244033230"/>
       <w:r>
         <w:t>5. Paso 3: tener las tablas al día</w:t>
       </w:r>
@@ -3772,7 +3772,7 @@
           <w:noProof/>
         </w:rPr>
         <w:drawing>
-          <wp:inline distT="0" distB="0" distL="0" distR="0" wp14:anchorId="61B9B809" wp14:editId="2CD628C8">
+          <wp:inline distT="0" distB="0" distL="0" distR="0" wp14:anchorId="32837577" wp14:editId="783E317D">
             <wp:extent cx="5400675" cy="771525"/>
             <wp:effectExtent l="0" t="0" r="0" b="0"/>
             <wp:docPr id="4" name="Imagen 4"/>
@@ -3877,7 +3877,7 @@
           <w:noProof/>
         </w:rPr>
         <w:drawing>
-          <wp:inline distT="0" distB="0" distL="0" distR="0" wp14:anchorId="2EE74FA2" wp14:editId="7AE6BE8F">
+          <wp:inline distT="0" distB="0" distL="0" distR="0" wp14:anchorId="04FD91C2" wp14:editId="0ECD7102">
             <wp:extent cx="5400675" cy="1685925"/>
             <wp:effectExtent l="0" t="0" r="0" b="0"/>
             <wp:docPr id="5" name="Imagen 5"/>
@@ -4024,7 +4024,7 @@
         <w:pStyle w:val="Ttulo1"/>
         <w:keepNext/>
       </w:pPr>
-      <w:bookmarkStart w:id="7" w:name="_Toc244028467"/>
+      <w:bookmarkStart w:id="7" w:name="_Toc244033231"/>
       <w:r>
         <w:t>6. Paso 4: abrir MySQL Workbench</w:t>
       </w:r>
@@ -4049,7 +4049,7 @@
           <w:noProof/>
         </w:rPr>
         <w:drawing>
-          <wp:inline distT="0" distB="0" distL="0" distR="0" wp14:anchorId="01296372" wp14:editId="2BD8CAAE">
+          <wp:inline distT="0" distB="0" distL="0" distR="0" wp14:anchorId="7A750FAC" wp14:editId="77E7314B">
             <wp:extent cx="5400675" cy="1228725"/>
             <wp:effectExtent l="0" t="0" r="0" b="0"/>
             <wp:docPr id="6" name="Imagen 6"/>
@@ -4138,7 +4138,7 @@
         <w:pStyle w:val="Ttulo1"/>
         <w:keepNext/>
       </w:pPr>
-      <w:bookmarkStart w:id="8" w:name="_Toc244028468"/>
+      <w:bookmarkStart w:id="8" w:name="_Toc244033232"/>
       <w:r>
         <w:t>7. Paso 5: crear la conexión</w:t>
       </w:r>
@@ -4189,7 +4189,7 @@
         </w:rPr>
         <w:lastRenderedPageBreak/>
         <w:drawing>
-          <wp:inline distT="0" distB="0" distL="0" distR="0" wp14:anchorId="36E44CE1" wp14:editId="6F6626A5">
+          <wp:inline distT="0" distB="0" distL="0" distR="0" wp14:anchorId="7B5AF52A" wp14:editId="6B7C5440">
             <wp:extent cx="4495800" cy="3533775"/>
             <wp:effectExtent l="0" t="0" r="0" b="0"/>
             <wp:docPr id="7" name="Imagen 7"/>
@@ -5075,7 +5075,7 @@
         </w:rPr>
         <w:lastRenderedPageBreak/>
         <w:drawing>
-          <wp:inline distT="0" distB="0" distL="0" distR="0" wp14:anchorId="3CE57470" wp14:editId="49B0C720">
+          <wp:inline distT="0" distB="0" distL="0" distR="0" wp14:anchorId="1BB90F2B" wp14:editId="25879819">
             <wp:extent cx="4495800" cy="3533775"/>
             <wp:effectExtent l="0" t="0" r="0" b="0"/>
             <wp:docPr id="8" name="Imagen 8"/>
@@ -5134,7 +5134,7 @@
         <w:pStyle w:val="Ttulo1"/>
         <w:keepNext/>
       </w:pPr>
-      <w:bookmarkStart w:id="9" w:name="_Toc244028469"/>
+      <w:bookmarkStart w:id="9" w:name="_Toc244033233"/>
       <w:r>
         <w:t>8. Paso 6: guardar la contraseña y probar</w:t>
       </w:r>
@@ -5217,7 +5217,7 @@
           <w:noProof/>
         </w:rPr>
         <w:drawing>
-          <wp:inline distT="0" distB="0" distL="0" distR="0" wp14:anchorId="1DD3F9AF" wp14:editId="681E66FE">
+          <wp:inline distT="0" distB="0" distL="0" distR="0" wp14:anchorId="5DE2C8C1" wp14:editId="603C6D80">
             <wp:extent cx="4495800" cy="3533775"/>
             <wp:effectExtent l="0" t="0" r="0" b="0"/>
             <wp:docPr id="9" name="Imagen 9"/>
@@ -5338,7 +5338,7 @@
         <w:pStyle w:val="Ttulo1"/>
         <w:keepNext/>
       </w:pPr>
-      <w:bookmarkStart w:id="10" w:name="_Toc244028470"/>
+      <w:bookmarkStart w:id="10" w:name="_Toc244033234"/>
       <w:r>
         <w:t>9. Paso 7: conectarte y ver las tablas</w:t>
       </w:r>
@@ -5415,7 +5415,7 @@
           <w:noProof/>
         </w:rPr>
         <w:drawing>
-          <wp:inline distT="0" distB="0" distL="0" distR="0" wp14:anchorId="716215DB" wp14:editId="5AED6EDD">
+          <wp:inline distT="0" distB="0" distL="0" distR="0" wp14:anchorId="0941BC18" wp14:editId="39D98A1C">
             <wp:extent cx="3962400" cy="2171700"/>
             <wp:effectExtent l="0" t="0" r="0" b="0"/>
             <wp:docPr id="10" name="Imagen 10"/>
@@ -5474,7 +5474,7 @@
         <w:pStyle w:val="Ttulo1"/>
         <w:keepNext/>
       </w:pPr>
-      <w:bookmarkStart w:id="11" w:name="_Toc244028471"/>
+      <w:bookmarkStart w:id="11" w:name="_Toc244033235"/>
       <w:r>
         <w:t>10. Qué guarda cada tabla</w:t>
       </w:r>
@@ -5485,7 +5485,7 @@
         <w:pStyle w:val="Ttulo2"/>
         <w:keepNext/>
       </w:pPr>
-      <w:bookmarkStart w:id="12" w:name="_Toc244028472"/>
+      <w:bookmarkStart w:id="12" w:name="_Toc244033236"/>
       <w:r>
         <w:t>10.1 Tablas del hotel</w:t>
       </w:r>
@@ -5658,7 +5658,7 @@
                 <w:sz w:val="20"/>
                 <w:szCs w:val="20"/>
               </w:rPr>
-              <w:t>Fichas de huéspedes: nombre, documento, teléfono, correo. user_id indica si el huésped tiene cuenta web (rol Cliente)</w:t>
+              <w:t>Fichas de huéspedes: nombre, tipo y número de documento, teléfono y nacionalidad (el correo está en users). user_id indica si el huésped tiene cuenta web (rol Cliente)</w:t>
             </w:r>
           </w:p>
         </w:tc>
@@ -6557,7 +6557,7 @@
         <w:pStyle w:val="Ttulo2"/>
         <w:keepNext/>
       </w:pPr>
-      <w:bookmarkStart w:id="13" w:name="_Toc244028473"/>
+      <w:bookmarkStart w:id="13" w:name="_Toc244033237"/>
       <w:r>
         <w:t>10.2 Cuentas y permisos</w:t>
       </w:r>
@@ -6946,7 +6946,7 @@
         <w:pStyle w:val="Ttulo2"/>
         <w:keepNext/>
       </w:pPr>
-      <w:bookmarkStart w:id="14" w:name="_Toc244028474"/>
+      <w:bookmarkStart w:id="14" w:name="_Toc244033238"/>
       <w:r>
         <w:t>10.3 Tablas internas de Laravel</w:t>
       </w:r>
@@ -7291,7 +7291,7 @@
         <w:pStyle w:val="Ttulo1"/>
         <w:keepNext/>
       </w:pPr>
-      <w:bookmarkStart w:id="15" w:name="_Toc244028475"/>
+      <w:bookmarkStart w:id="15" w:name="_Toc244033239"/>
       <w:r>
         <w:t>11. Consultas útiles (con su resultado real)</w:t>
       </w:r>
@@ -7310,7 +7310,7 @@
         <w:pStyle w:val="Ttulo2"/>
         <w:keepNext/>
       </w:pPr>
-      <w:bookmarkStart w:id="16" w:name="_Toc244028476"/>
+      <w:bookmarkStart w:id="16" w:name="_Toc244033240"/>
       <w:r>
         <w:lastRenderedPageBreak/>
         <w:t>11.1 Cuántos registros hay en cada tabla</w:t>
@@ -7666,7 +7666,7 @@
         <w:pStyle w:val="Ttulo2"/>
         <w:keepNext/>
       </w:pPr>
-      <w:bookmarkStart w:id="17" w:name="_Toc244028477"/>
+      <w:bookmarkStart w:id="17" w:name="_Toc244033241"/>
       <w:r>
         <w:t>11.2 Cuentas de demostración y su rol</w:t>
       </w:r>
@@ -7953,7 +7953,7 @@
         <w:pStyle w:val="Ttulo2"/>
         <w:keepNext/>
       </w:pPr>
-      <w:bookmarkStart w:id="18" w:name="_Toc244028478"/>
+      <w:bookmarkStart w:id="18" w:name="_Toc244033242"/>
       <w:r>
         <w:t>11.3 Tipos de habitación y lo que incluyen</w:t>
       </w:r>
@@ -8156,7 +8156,7 @@
         <w:pStyle w:val="Ttulo2"/>
         <w:keepNext/>
       </w:pPr>
-      <w:bookmarkStart w:id="19" w:name="_Toc244028479"/>
+      <w:bookmarkStart w:id="19" w:name="_Toc244033243"/>
       <w:r>
         <w:t>11.4 Próximas llegadas</w:t>
       </w:r>
@@ -8545,7 +8545,7 @@
         <w:pStyle w:val="Ttulo2"/>
         <w:keepNext/>
       </w:pPr>
-      <w:bookmarkStart w:id="20" w:name="_Toc244028480"/>
+      <w:bookmarkStart w:id="20" w:name="_Toc244033244"/>
       <w:r>
         <w:t>11.5 Reservas por estado</w:t>
       </w:r>
@@ -8731,7 +8731,7 @@
         <w:pStyle w:val="Ttulo1"/>
         <w:keepNext/>
       </w:pPr>
-      <w:bookmarkStart w:id="21" w:name="_Toc244028481"/>
+      <w:bookmarkStart w:id="21" w:name="_Toc244033245"/>
       <w:r>
         <w:t>12. Cuidado al modificar datos</w:t>
       </w:r>
@@ -9089,7 +9089,7 @@
         <w:pStyle w:val="Ttulo1"/>
         <w:keepNext/>
       </w:pPr>
-      <w:bookmarkStart w:id="22" w:name="_Toc244028482"/>
+      <w:bookmarkStart w:id="22" w:name="_Toc244033246"/>
       <w:r>
         <w:t>13. Respaldo y apagado</w:t>
       </w:r>
@@ -9100,7 +9100,7 @@
         <w:pStyle w:val="Ttulo2"/>
         <w:keepNext/>
       </w:pPr>
-      <w:bookmarkStart w:id="23" w:name="_Toc244028483"/>
+      <w:bookmarkStart w:id="23" w:name="_Toc244033247"/>
       <w:r>
         <w:t>13.1 Hacer un respaldo</w:t>
       </w:r>
@@ -9183,7 +9183,7 @@
         <w:pStyle w:val="Ttulo2"/>
         <w:keepNext/>
       </w:pPr>
-      <w:bookmarkStart w:id="24" w:name="_Toc244028484"/>
+      <w:bookmarkStart w:id="24" w:name="_Toc244033248"/>
       <w:r>
         <w:t>13.2 Apagar la base</w:t>
       </w:r>
@@ -9257,7 +9257,7 @@
         <w:pStyle w:val="Ttulo1"/>
         <w:keepNext/>
       </w:pPr>
-      <w:bookmarkStart w:id="25" w:name="_Toc244028485"/>
+      <w:bookmarkStart w:id="25" w:name="_Toc244033249"/>
       <w:r>
         <w:t>14. Si algo sale mal</w:t>
       </w:r>
@@ -10070,7 +10070,7 @@
         <w:pStyle w:val="Ttulo1"/>
         <w:keepNext/>
       </w:pPr>
-      <w:bookmarkStart w:id="26" w:name="_Toc244028486"/>
+      <w:bookmarkStart w:id="26" w:name="_Toc244033250"/>
       <w:r>
         <w:t>15. Sin Workbench: consultar desde la terminal</w:t>
       </w:r>
@@ -10127,7 +10127,7 @@
           <w:noProof/>
         </w:rPr>
         <w:drawing>
-          <wp:inline distT="0" distB="0" distL="0" distR="0" wp14:anchorId="61C2FB4F" wp14:editId="102FFC8A">
+          <wp:inline distT="0" distB="0" distL="0" distR="0" wp14:anchorId="69942026" wp14:editId="72A232AF">
             <wp:extent cx="5400675" cy="1228725"/>
             <wp:effectExtent l="0" t="0" r="0" b="0"/>
             <wp:docPr id="11" name="Imagen 11"/>
@@ -10194,7 +10194,7 @@
         <w:pStyle w:val="Ttulo1"/>
         <w:keepNext/>
       </w:pPr>
-      <w:bookmarkStart w:id="27" w:name="_Toc244028487"/>
+      <w:bookmarkStart w:id="27" w:name="_Toc244033251"/>
       <w:r>
         <w:lastRenderedPageBreak/>
         <w:t>16. Resumen rápido</w:t>
@@ -10545,10 +10545,10 @@
 <file path=word/numbering.xml><?xml version="1.0" encoding="utf-8"?>
 <w:numbering xmlns:wpc="http://schemas.microsoft.com/office/word/2010/wordprocessingCanvas" xmlns:cx="http://schemas.microsoft.com/office/drawing/2014/chartex" xmlns:cx1="http://schemas.microsoft.com/office/drawing/2015/9/8/chartex" xmlns:cx2="http://schemas.microsoft.com/office/drawing/2015/10/21/chartex" xmlns:cx3="http://schemas.microsoft.com/office/drawing/2016/5/9/chartex" xmlns:cx4="http://schemas.microsoft.com/office/drawing/2016/5/10/chartex" xmlns:cx5="http://schemas.microsoft.com/office/drawing/2016/5/11/chartex" xmlns:cx6="http://schemas.microsoft.com/office/drawing/2016/5/12/chartex" xmlns:cx7="http://schemas.microsoft.com/office/drawing/2016/5/13/chartex" xmlns:cx8="http://schemas.microsoft.com/office/drawing/2016/5/14/chartex" xmlns:mc="http://schemas.openxmlformats.org/markup-compatibility/2006" xmlns:aink="http://schemas.microsoft.com/office/drawing/2016/ink" xmlns:am3d="http://schemas.microsoft.com/office/drawing/2017/model3d" xmlns:o="urn:schemas-microsoft-com:office:office" xmlns:oel="http://schemas.microsoft.com/office/2019/extlst" xmlns:r="http://schemas.openxmlformats.org/officeDocument/2006/relationships" xmlns:m="http://schemas.openxmlformats.org/officeDocument/2006/math" xmlns:v="urn:schemas-microsoft-com:vml" xmlns:wp14="http://schemas.microsoft.com/office/word/2010/wordprocessingDrawing" xmlns:wp="http://schemas.openxmlformats.org/drawingml/2006/wordprocessingDrawing" xmlns:w10="urn:schemas-microsoft-com:office:word" xmlns:w="http://schemas.openxmlformats.org/wordprocessingml/2006/main" xmlns:w14="http://schemas.microsoft.com/office/word/2010/wordml" xmlns:w15="http://schemas.microsoft.com/office/word/2012/wordml" xmlns:w16cex="http://schemas.microsoft.com/office/word/2018/wordml/cex" xmlns:w16cid="http://schemas.microsoft.com/office/word/2016/wordml/cid" xmlns:w16="http://schemas.microsoft.com/office/word/2018/wordml" xmlns:w16sdtdh="http://schemas.microsoft.com/office/word/2020/wordml/sdtdatahash" xmlns:w16se="http://schemas.microsoft.com/office/word/2015/wordml/symex" xmlns:wpg="http://schemas.microsoft.com/office/word/2010/wordprocessingGroup" xmlns:wpi="http://schemas.microsoft.com/office/word/2010/wordprocessingInk" xmlns:wne="http://schemas.microsoft.com/office/word/2006/wordml" xmlns:wps="http://schemas.microsoft.com/office/word/2010/wordprocessingShape" mc:Ignorable="w14 w15 w16se w16cid w16 w16cex w16sdtdh wp14">
   <w:abstractNum w:abstractNumId="0" w15:restartNumberingAfterBreak="0">
-    <w:nsid w:val="4E0C5CC6"/>
+    <w:nsid w:val="49755237"/>
     <w:multiLevelType w:val="hybridMultilevel"/>
-    <w:tmpl w:val="B428FF38"/>
-    <w:lvl w:ilvl="0" w:tplc="D27ED24A" w:tentative="1">
+    <w:tmpl w:val="AF889400"/>
+    <w:lvl w:ilvl="0" w:tplc="5E0EB846" w:tentative="1">
       <w:start w:val="1"/>
       <w:numFmt w:val="bullet"/>
       <w:lvlText w:val="●"/>
@@ -10557,7 +10557,7 @@
         <w:ind w:left="720" w:hanging="360"/>
       </w:pPr>
     </w:lvl>
-    <w:lvl w:ilvl="1" w:tplc="03F2CF8A" w:tentative="1">
+    <w:lvl w:ilvl="1" w:tplc="FC4458D6" w:tentative="1">
       <w:start w:val="1"/>
       <w:numFmt w:val="bullet"/>
       <w:lvlText w:val="○"/>
@@ -10566,7 +10566,7 @@
         <w:ind w:left="1440" w:hanging="360"/>
       </w:pPr>
     </w:lvl>
-    <w:lvl w:ilvl="2" w:tplc="80B05740" w:tentative="1">
+    <w:lvl w:ilvl="2" w:tplc="75F0FCBE" w:tentative="1">
       <w:start w:val="1"/>
       <w:numFmt w:val="bullet"/>
       <w:lvlText w:val="■"/>
@@ -10575,7 +10575,7 @@
         <w:ind w:left="2160" w:hanging="360"/>
       </w:pPr>
     </w:lvl>
-    <w:lvl w:ilvl="3" w:tplc="BEBA61A0" w:tentative="1">
+    <w:lvl w:ilvl="3" w:tplc="8C2AA7C2" w:tentative="1">
       <w:start w:val="1"/>
       <w:numFmt w:val="bullet"/>
       <w:lvlText w:val="●"/>
@@ -10584,7 +10584,7 @@
         <w:ind w:left="2880" w:hanging="360"/>
       </w:pPr>
     </w:lvl>
-    <w:lvl w:ilvl="4" w:tplc="A1C69814" w:tentative="1">
+    <w:lvl w:ilvl="4" w:tplc="3BB27ECE" w:tentative="1">
       <w:start w:val="1"/>
       <w:numFmt w:val="bullet"/>
       <w:lvlText w:val="○"/>
@@ -10593,7 +10593,7 @@
         <w:ind w:left="3600" w:hanging="360"/>
       </w:pPr>
     </w:lvl>
-    <w:lvl w:ilvl="5" w:tplc="CFF0EA92" w:tentative="1">
+    <w:lvl w:ilvl="5" w:tplc="1938F08E" w:tentative="1">
       <w:start w:val="1"/>
       <w:numFmt w:val="bullet"/>
       <w:lvlText w:val="■"/>
@@ -10602,7 +10602,7 @@
         <w:ind w:left="4320" w:hanging="360"/>
       </w:pPr>
     </w:lvl>
-    <w:lvl w:ilvl="6" w:tplc="822C7BC4" w:tentative="1">
+    <w:lvl w:ilvl="6" w:tplc="05063668" w:tentative="1">
       <w:start w:val="1"/>
       <w:numFmt w:val="bullet"/>
       <w:lvlText w:val="●"/>
@@ -10611,7 +10611,7 @@
         <w:ind w:left="5040" w:hanging="360"/>
       </w:pPr>
     </w:lvl>
-    <w:lvl w:ilvl="7" w:tplc="A2A62468" w:tentative="1">
+    <w:lvl w:ilvl="7" w:tplc="8BBAE418" w:tentative="1">
       <w:start w:val="1"/>
       <w:numFmt w:val="bullet"/>
       <w:lvlText w:val="●"/>
@@ -10620,7 +10620,7 @@
         <w:ind w:left="5760" w:hanging="360"/>
       </w:pPr>
     </w:lvl>
-    <w:lvl w:ilvl="8" w:tplc="28A81190" w:tentative="1">
+    <w:lvl w:ilvl="8" w:tplc="F1C81B20" w:tentative="1">
       <w:start w:val="1"/>
       <w:numFmt w:val="bullet"/>
       <w:lvlText w:val="●"/>
@@ -10631,10 +10631,10 @@
     </w:lvl>
   </w:abstractNum>
   <w:abstractNum w:abstractNumId="1" w15:restartNumberingAfterBreak="0">
-    <w:nsid w:val="4FC62E40"/>
+    <w:nsid w:val="608B6D1E"/>
     <w:multiLevelType w:val="hybridMultilevel"/>
-    <w:tmpl w:val="F718DC8E"/>
-    <w:lvl w:ilvl="0" w:tplc="F1AC1A80">
+    <w:tmpl w:val="BEC4DFB6"/>
+    <w:lvl w:ilvl="0" w:tplc="05A4D60C">
       <w:start w:val="1"/>
       <w:numFmt w:val="decimal"/>
       <w:lvlText w:val="%1."/>
@@ -10643,52 +10643,52 @@
         <w:ind w:left="540" w:hanging="300"/>
       </w:pPr>
     </w:lvl>
-    <w:lvl w:ilvl="1" w:tplc="E44E45E2">
+    <w:lvl w:ilvl="1" w:tplc="2DF8F768">
       <w:numFmt w:val="decimal"/>
       <w:lvlText w:val=""/>
       <w:lvlJc w:val="left"/>
     </w:lvl>
-    <w:lvl w:ilvl="2" w:tplc="51B60B7E">
+    <w:lvl w:ilvl="2" w:tplc="DF44CB86">
       <w:numFmt w:val="decimal"/>
       <w:lvlText w:val=""/>
       <w:lvlJc w:val="left"/>
     </w:lvl>
-    <w:lvl w:ilvl="3" w:tplc="57D03CC4">
+    <w:lvl w:ilvl="3" w:tplc="84E0E916">
       <w:numFmt w:val="decimal"/>
       <w:lvlText w:val=""/>
       <w:lvlJc w:val="left"/>
     </w:lvl>
-    <w:lvl w:ilvl="4" w:tplc="83A61AA0">
+    <w:lvl w:ilvl="4" w:tplc="B1881F0A">
       <w:numFmt w:val="decimal"/>
       <w:lvlText w:val=""/>
       <w:lvlJc w:val="left"/>
     </w:lvl>
-    <w:lvl w:ilvl="5" w:tplc="B0122644">
+    <w:lvl w:ilvl="5" w:tplc="18249FD8">
       <w:numFmt w:val="decimal"/>
       <w:lvlText w:val=""/>
       <w:lvlJc w:val="left"/>
     </w:lvl>
-    <w:lvl w:ilvl="6" w:tplc="66E4B1CC">
+    <w:lvl w:ilvl="6" w:tplc="B8621D0E">
       <w:numFmt w:val="decimal"/>
       <w:lvlText w:val=""/>
       <w:lvlJc w:val="left"/>
     </w:lvl>
-    <w:lvl w:ilvl="7" w:tplc="4EF227DE">
+    <w:lvl w:ilvl="7" w:tplc="0310E2E4">
       <w:numFmt w:val="decimal"/>
       <w:lvlText w:val=""/>
       <w:lvlJc w:val="left"/>
     </w:lvl>
-    <w:lvl w:ilvl="8" w:tplc="BB50A374">
+    <w:lvl w:ilvl="8" w:tplc="F9365726">
       <w:numFmt w:val="decimal"/>
       <w:lvlText w:val=""/>
       <w:lvlJc w:val="left"/>
     </w:lvl>
   </w:abstractNum>
   <w:abstractNum w:abstractNumId="2" w15:restartNumberingAfterBreak="0">
-    <w:nsid w:val="53065E08"/>
+    <w:nsid w:val="783F625E"/>
     <w:multiLevelType w:val="hybridMultilevel"/>
-    <w:tmpl w:val="5574C71E"/>
-    <w:lvl w:ilvl="0" w:tplc="6428F324">
+    <w:tmpl w:val="0A34CB4E"/>
+    <w:lvl w:ilvl="0" w:tplc="2DCAFD80">
       <w:start w:val="1"/>
       <w:numFmt w:val="bullet"/>
       <w:lvlText w:val="•"/>
@@ -10697,84 +10697,84 @@
         <w:ind w:left="540" w:hanging="270"/>
       </w:pPr>
     </w:lvl>
-    <w:lvl w:ilvl="1" w:tplc="485C4014">
+    <w:lvl w:ilvl="1" w:tplc="A55AF374">
       <w:numFmt w:val="decimal"/>
       <w:lvlText w:val=""/>
       <w:lvlJc w:val="left"/>
     </w:lvl>
-    <w:lvl w:ilvl="2" w:tplc="B9E4F734">
+    <w:lvl w:ilvl="2" w:tplc="4DDAF72A">
       <w:numFmt w:val="decimal"/>
       <w:lvlText w:val=""/>
       <w:lvlJc w:val="left"/>
     </w:lvl>
-    <w:lvl w:ilvl="3" w:tplc="2326D2A6">
+    <w:lvl w:ilvl="3" w:tplc="AB627C92">
       <w:numFmt w:val="decimal"/>
       <w:lvlText w:val=""/>
       <w:lvlJc w:val="left"/>
     </w:lvl>
-    <w:lvl w:ilvl="4" w:tplc="E9146240">
+    <w:lvl w:ilvl="4" w:tplc="9044ED68">
       <w:numFmt w:val="decimal"/>
       <w:lvlText w:val=""/>
       <w:lvlJc w:val="left"/>
     </w:lvl>
-    <w:lvl w:ilvl="5" w:tplc="BD30929E">
+    <w:lvl w:ilvl="5" w:tplc="6F80F226">
       <w:numFmt w:val="decimal"/>
       <w:lvlText w:val=""/>
       <w:lvlJc w:val="left"/>
     </w:lvl>
-    <w:lvl w:ilvl="6" w:tplc="348C4080">
+    <w:lvl w:ilvl="6" w:tplc="5EBE153E">
       <w:numFmt w:val="decimal"/>
       <w:lvlText w:val=""/>
       <w:lvlJc w:val="left"/>
     </w:lvl>
-    <w:lvl w:ilvl="7" w:tplc="EC18E3A0">
+    <w:lvl w:ilvl="7" w:tplc="36FE0230">
       <w:numFmt w:val="decimal"/>
       <w:lvlText w:val=""/>
       <w:lvlJc w:val="left"/>
     </w:lvl>
-    <w:lvl w:ilvl="8" w:tplc="0992A02A">
+    <w:lvl w:ilvl="8" w:tplc="45984076">
       <w:numFmt w:val="decimal"/>
       <w:lvlText w:val=""/>
       <w:lvlJc w:val="left"/>
     </w:lvl>
   </w:abstractNum>
-  <w:num w:numId="1" w16cid:durableId="1377774803">
+  <w:num w:numId="1" w16cid:durableId="933590208">
     <w:abstractNumId w:val="0"/>
     <w:lvlOverride w:ilvl="0">
       <w:startOverride w:val="1"/>
     </w:lvlOverride>
   </w:num>
-  <w:num w:numId="2" w16cid:durableId="1159076675">
+  <w:num w:numId="2" w16cid:durableId="340619413">
     <w:abstractNumId w:val="1"/>
     <w:lvlOverride w:ilvl="0">
       <w:startOverride w:val="1"/>
     </w:lvlOverride>
   </w:num>
-  <w:num w:numId="3" w16cid:durableId="448089571">
+  <w:num w:numId="3" w16cid:durableId="134179647">
     <w:abstractNumId w:val="2"/>
     <w:lvlOverride w:ilvl="0">
       <w:startOverride w:val="1"/>
     </w:lvlOverride>
   </w:num>
-  <w:num w:numId="4" w16cid:durableId="1443843286">
+  <w:num w:numId="4" w16cid:durableId="2015497256">
     <w:abstractNumId w:val="1"/>
     <w:lvlOverride w:ilvl="0">
       <w:startOverride w:val="1"/>
     </w:lvlOverride>
   </w:num>
-  <w:num w:numId="5" w16cid:durableId="235669488">
+  <w:num w:numId="5" w16cid:durableId="572009024">
     <w:abstractNumId w:val="1"/>
     <w:lvlOverride w:ilvl="0">
       <w:startOverride w:val="1"/>
     </w:lvlOverride>
   </w:num>
-  <w:num w:numId="6" w16cid:durableId="1965117381">
+  <w:num w:numId="6" w16cid:durableId="938298737">
     <w:abstractNumId w:val="1"/>
     <w:lvlOverride w:ilvl="0">
       <w:startOverride w:val="1"/>
     </w:lvlOverride>
   </w:num>
-  <w:num w:numId="7" w16cid:durableId="1562515751">
+  <w:num w:numId="7" w16cid:durableId="1276451197">
     <w:abstractNumId w:val="1"/>
     <w:lvlOverride w:ilvl="0">
       <w:startOverride w:val="1"/>

</xml_diff>